<commit_message>
Add code availability URL and cleanup instructions to both manuscripts
</commit_message>
<xml_diff>
--- a/paper/manuscript_B_adaptive_v1.docx
+++ b/paper/manuscript_B_adaptive_v1.docx
@@ -4921,7 +4921,74 @@
           <w:rFonts w:ascii="Times New Roman" w:hAnsi="Times New Roman" w:eastAsia="SimSun"/>
           <w:sz w:val="22"/>
         </w:rPr>
+        <w:t xml:space="preserve">Code and results: </w:t>
+      </w:r>
+      <w:r>
+        <w:rPr>
+          <w:rFonts w:ascii="Times New Roman" w:hAnsi="Times New Roman" w:eastAsia="SimSun"/>
+          <w:b/>
+          <w:sz w:val="22"/>
+        </w:rPr>
+        <w:t>https://github.com/luj00133-dev/rag-poison-fairness</w:t>
+      </w:r>
+    </w:p>
+    <w:p>
+      <w:r>
+        <w:rPr>
+          <w:rFonts w:ascii="Times New Roman" w:hAnsi="Times New Roman" w:eastAsia="SimSun"/>
+          <w:sz w:val="22"/>
+        </w:rPr>
         <w:t>No GPU is required; both corpora complete on CPU in under three minutes.</w:t>
+      </w:r>
+    </w:p>
+    <w:p>
+      <w:r>
+        <w:rPr>
+          <w:rFonts w:ascii="Times New Roman" w:hAnsi="Times New Roman" w:eastAsia="SimSun"/>
+          <w:sz w:val="22"/>
+        </w:rPr>
+        <w:t>Real-encoder runs (the GTE-base sweep of §5.2b) need</w:t>
+      </w:r>
+    </w:p>
+    <w:p>
+      <w:r>
+        <w:rPr>
+          <w:rFonts w:ascii="Consolas" w:hAnsi="Consolas" w:eastAsia="Consolas"/>
+          <w:sz w:val="21"/>
+        </w:rPr>
+        <w:t>HF_ENDPOINT=https://hf-mirror.com</w:t>
+      </w:r>
+      <w:r>
+        <w:rPr>
+          <w:rFonts w:ascii="Times New Roman" w:hAnsi="Times New Roman" w:eastAsia="SimSun"/>
+          <w:sz w:val="22"/>
+        </w:rPr>
+        <w:t xml:space="preserve"> on networks where huggingface.co is</w:t>
+      </w:r>
+    </w:p>
+    <w:p>
+      <w:r>
+        <w:rPr>
+          <w:rFonts w:ascii="Times New Roman" w:hAnsi="Times New Roman" w:eastAsia="SimSun"/>
+          <w:sz w:val="22"/>
+        </w:rPr>
+        <w:t xml:space="preserve">unreachable, and </w:t>
+      </w:r>
+      <w:r>
+        <w:rPr>
+          <w:rFonts w:ascii="Consolas" w:hAnsi="Consolas" w:eastAsia="Consolas"/>
+          <w:sz w:val="21"/>
+        </w:rPr>
+        <w:t>python -m src.run_experiment --config configs/align_gte_ad.json</w:t>
+      </w:r>
+    </w:p>
+    <w:p>
+      <w:r>
+        <w:rPr>
+          <w:rFonts w:ascii="Times New Roman" w:hAnsi="Times New Roman" w:eastAsia="SimSun"/>
+          <w:sz w:val="22"/>
+        </w:rPr>
+        <w:t>reproduces the adaptive table.</w:t>
       </w:r>
     </w:p>
     <w:sectPr>

</xml_diff>